<commit_message>
Add relay file logging and protocol version
</commit_message>
<xml_diff>
--- a/ServiceGate Protocol Socket实验文档.docx
+++ b/ServiceGate Protocol Socket实验文档.docx
@@ -4,7 +4,7 @@
   <w:body>
     <w:p>
       <w:pPr>
-        <w:pStyle w:val="Title"/>
+        <w:pStyle w:val="Heading1"/>
       </w:pPr>
       <w:r>
         <w:t>网络 Socket 编程实验文档</w:t>
@@ -12,7 +12,7 @@
     </w:p>
     <w:p>
       <w:pPr>
-        <w:pStyle w:val="Heading1"/>
+        <w:pStyle w:val="Heading2"/>
       </w:pPr>
       <w:r>
         <w:t>ServiceGate Protocol 实验说明</w:t>
@@ -20,7 +20,7 @@
     </w:p>
     <w:p>
       <w:pPr>
-        <w:pStyle w:val="Heading2"/>
+        <w:pStyle w:val="Heading3"/>
       </w:pPr>
       <w:r>
         <w:t>1. 实验目的</w:t>
@@ -73,165 +73,7 @@
     </w:p>
     <w:p>
       <w:pPr>
-        <w:pStyle w:val="Heading2"/>
-      </w:pPr>
-      <w:r>
-        <w:t>2. 程序角色</w:t>
-      </w:r>
-    </w:p>
-    <w:p>
-      <w:r>
-        <w:t>本实验有三个角色：</w:t>
-      </w:r>
-    </w:p>
-    <w:tbl>
-      <w:tblPr>
-        <w:tblStyle w:val="TableGrid"/>
-        <w:tblW w:type="auto" w:w="0"/>
-        <w:tblLook w:firstColumn="1" w:firstRow="1" w:lastColumn="0" w:lastRow="0" w:noHBand="0" w:noVBand="1" w:val="04A0"/>
-      </w:tblPr>
-      <w:tblGrid>
-        <w:gridCol w:w="2880"/>
-        <w:gridCol w:w="2880"/>
-        <w:gridCol w:w="2880"/>
-      </w:tblGrid>
-      <w:tr>
-        <w:tc>
-          <w:tcPr>
-            <w:tcW w:type="dxa" w:w="2880"/>
-          </w:tcPr>
-          <w:p>
-            <w:r>
-              <w:t>角色</w:t>
-            </w:r>
-          </w:p>
-        </w:tc>
-        <w:tc>
-          <w:tcPr>
-            <w:tcW w:type="dxa" w:w="2880"/>
-          </w:tcPr>
-          <w:p>
-            <w:r>
-              <w:t>程序</w:t>
-            </w:r>
-          </w:p>
-        </w:tc>
-        <w:tc>
-          <w:tcPr>
-            <w:tcW w:type="dxa" w:w="2880"/>
-          </w:tcPr>
-          <w:p>
-            <w:r>
-              <w:t>作用</w:t>
-            </w:r>
-          </w:p>
-        </w:tc>
-      </w:tr>
-      <w:tr>
-        <w:tc>
-          <w:tcPr>
-            <w:tcW w:type="dxa" w:w="2880"/>
-          </w:tcPr>
-          <w:p>
-            <w:r>
-              <w:t>Relay</w:t>
-            </w:r>
-          </w:p>
-        </w:tc>
-        <w:tc>
-          <w:tcPr>
-            <w:tcW w:type="dxa" w:w="2880"/>
-          </w:tcPr>
-          <w:p>
-            <w:r>
-              <w:t>`relay.py`</w:t>
-            </w:r>
-          </w:p>
-        </w:tc>
-        <w:tc>
-          <w:tcPr>
-            <w:tcW w:type="dxa" w:w="2880"/>
-          </w:tcPr>
-          <w:p>
-            <w:r>
-              <w:t>接收 Agent 和 Client 连接，维护服务目录，校验通用权限和 schema，并转发 `CALL`</w:t>
-            </w:r>
-          </w:p>
-        </w:tc>
-      </w:tr>
-      <w:tr>
-        <w:tc>
-          <w:tcPr>
-            <w:tcW w:type="dxa" w:w="2880"/>
-          </w:tcPr>
-          <w:p>
-            <w:r>
-              <w:t>Agent</w:t>
-            </w:r>
-          </w:p>
-        </w:tc>
-        <w:tc>
-          <w:tcPr>
-            <w:tcW w:type="dxa" w:w="2880"/>
-          </w:tcPr>
-          <w:p>
-            <w:r>
-              <w:t>`agent.py`</w:t>
-            </w:r>
-          </w:p>
-        </w:tc>
-        <w:tc>
-          <w:tcPr>
-            <w:tcW w:type="dxa" w:w="2880"/>
-          </w:tcPr>
-          <w:p>
-            <w:r>
-              <w:t>主动连接 Relay，读取配置文件发布服务，并把调用分发给本地 handler</w:t>
-            </w:r>
-          </w:p>
-        </w:tc>
-      </w:tr>
-      <w:tr>
-        <w:tc>
-          <w:tcPr>
-            <w:tcW w:type="dxa" w:w="2880"/>
-          </w:tcPr>
-          <w:p>
-            <w:r>
-              <w:t>Client</w:t>
-            </w:r>
-          </w:p>
-        </w:tc>
-        <w:tc>
-          <w:tcPr>
-            <w:tcW w:type="dxa" w:w="2880"/>
-          </w:tcPr>
-          <w:p>
-            <w:r>
-              <w:t>`client.py`</w:t>
-            </w:r>
-          </w:p>
-        </w:tc>
-        <w:tc>
-          <w:tcPr>
-            <w:tcW w:type="dxa" w:w="2880"/>
-          </w:tcPr>
-          <w:p>
-            <w:r>
-              <w:t>登录 Relay，查看服务列表，并调用某个服务</w:t>
-            </w:r>
-          </w:p>
-        </w:tc>
-      </w:tr>
-    </w:tbl>
-    <w:p>
-      <w:r>
-        <w:t>Relay 不执行具体业务逻辑。比如文件读取、命令执行、HTTP 转发都在 Agent 端 handler 中完成。</w:t>
-      </w:r>
-    </w:p>
-    <w:p>
-      <w:pPr>
-        <w:pStyle w:val="Heading2"/>
+        <w:pStyle w:val="Heading3"/>
       </w:pPr>
       <w:r>
         <w:t>3. 文件结构</w:t>
@@ -514,7 +356,7 @@
     </w:tbl>
     <w:p>
       <w:pPr>
-        <w:pStyle w:val="Heading2"/>
+        <w:pStyle w:val="Heading3"/>
       </w:pPr>
       <w:r>
         <w:t>4. 协议帧格式</w:t>
@@ -759,17 +601,17 @@
           <w:rFonts w:ascii="Courier New" w:hAnsi="Courier New"/>
           <w:sz w:val="18"/>
         </w:rPr>
-        <w:t>version, type, id, role, cmd, token, service_id, payload, status, message, ext</w:t>
+        <w:t>version, protocol_version, type, id, role, cmd, token, service_id, payload, status, message, ext</w:t>
       </w:r>
     </w:p>
     <w:p>
       <w:r>
-        <w:t>其中 `id` 用于匹配请求和响应。</w:t>
+        <w:t>其中 `version` 和 `protocol_version` 当前均为 `1.0`；`protocol_version` 是显式协议版本字段，`id` 用于匹配请求和响应。</w:t>
       </w:r>
     </w:p>
     <w:p>
       <w:pPr>
-        <w:pStyle w:val="Heading2"/>
+        <w:pStyle w:val="Heading3"/>
       </w:pPr>
       <w:r>
         <w:t>5. 核心命令</w:t>
@@ -947,7 +789,7 @@
     </w:p>
     <w:p>
       <w:pPr>
-        <w:pStyle w:val="Heading2"/>
+        <w:pStyle w:val="Heading3"/>
       </w:pPr>
       <w:r>
         <w:t>6. 服务配置</w:t>
@@ -1221,7 +1063,7 @@
     </w:p>
     <w:p>
       <w:pPr>
-        <w:pStyle w:val="Heading2"/>
+        <w:pStyle w:val="Heading3"/>
       </w:pPr>
       <w:r>
         <w:t>7. 运行方法</w:t>
@@ -1256,7 +1098,7 @@
           <w:rFonts w:ascii="Courier New" w:hAnsi="Courier New"/>
           <w:sz w:val="18"/>
         </w:rPr>
-        <w:t>python3 relay.py --host 127.0.0.1 --port 9000</w:t>
+        <w:t>python3 relay.py --host 127.0.0.1 --port 9000 --log-file relay.log</w:t>
         <w:br/>
         <w:t>python3 agent.py</w:t>
         <w:br/>
@@ -1270,7 +1112,7 @@
     </w:p>
     <w:p>
       <w:pPr>
-        <w:pStyle w:val="Heading2"/>
+        <w:pStyle w:val="Heading3"/>
       </w:pPr>
       <w:r>
         <w:t>8. Client 交互命令</w:t>
@@ -1319,7 +1161,7 @@
     </w:p>
     <w:p>
       <w:pPr>
-        <w:pStyle w:val="Heading2"/>
+        <w:pStyle w:val="Heading3"/>
       </w:pPr>
       <w:r>
         <w:t>9. file-box 说明</w:t>
@@ -1380,7 +1222,7 @@
     </w:p>
     <w:p>
       <w:pPr>
-        <w:pStyle w:val="Heading2"/>
+        <w:pStyle w:val="Heading3"/>
       </w:pPr>
       <w:r>
         <w:t>10. 已实现功能</w:t>
@@ -1497,7 +1339,7 @@
     </w:p>
     <w:p>
       <w:pPr>
-        <w:pStyle w:val="Heading2"/>
+        <w:pStyle w:val="Heading3"/>
       </w:pPr>
       <w:r>
         <w:t>11. 没有实现或只做了原型的部分</w:t>
@@ -1566,7 +1408,7 @@
     </w:p>
     <w:p>
       <w:pPr>
-        <w:pStyle w:val="Heading2"/>
+        <w:pStyle w:val="Heading3"/>
       </w:pPr>
       <w:r>
         <w:t>12. 错误响应格式</w:t>
@@ -1741,7 +1583,7 @@
     </w:tbl>
     <w:p>
       <w:pPr>
-        <w:pStyle w:val="Heading2"/>
+        <w:pStyle w:val="Heading3"/>
       </w:pPr>
       <w:r>
         <w:t>13. Relay 日志</w:t>
@@ -1765,7 +1607,7 @@
     </w:p>
     <w:p>
       <w:r>
-        <w:t>这些日志用于实验观察，不写入文件。需要保存时可以用 shell 重定向：</w:t>
+        <w:t>Relay 日志会即时输出到终端。需要同时保存到本地文件时使用 `--log-file`：</w:t>
       </w:r>
     </w:p>
     <w:p>
@@ -1774,12 +1616,12 @@
           <w:rFonts w:ascii="Courier New" w:hAnsi="Courier New"/>
           <w:sz w:val="18"/>
         </w:rPr>
-        <w:t>python3 relay.py --host 127.0.0.1 --port 9000 &gt; relay.log</w:t>
+        <w:t>python3 relay.py --host 127.0.0.1 --port 9000 --log-file relay.log</w:t>
       </w:r>
     </w:p>
     <w:p>
       <w:pPr>
-        <w:pStyle w:val="Heading2"/>
+        <w:pStyle w:val="Heading3"/>
       </w:pPr>
       <w:r>
         <w:t>14. 测试建议</w:t>
@@ -2124,7 +1966,7 @@
     </w:tbl>
     <w:p>
       <w:pPr>
-        <w:pStyle w:val="Heading2"/>
+        <w:pStyle w:val="Heading3"/>
       </w:pPr>
       <w:r>
         <w:t>15. 录屏建议</w:t>
@@ -2144,18 +1986,27 @@
       </w:r>
     </w:p>
     <w:p>
+      <w:pPr>
+        <w:pStyle w:val="ListBullet"/>
+      </w:pPr>
       <w:r>
-        <w:t xml:space="preserve">   - 展示 `protocol.py`、`relay.py`、`agent.py`、`client.py`。</w:t>
+        <w:t>展示 `protocol.py`、`relay.py`、`agent.py`、`client.py`。</w:t>
       </w:r>
     </w:p>
     <w:p>
+      <w:pPr>
+        <w:pStyle w:val="ListBullet"/>
+      </w:pPr>
       <w:r>
-        <w:t xml:space="preserve">   - 展示 `agent.config.json` 中的 `services_config`。</w:t>
+        <w:t>展示 `agent.config.json` 中的 `services_config`。</w:t>
       </w:r>
     </w:p>
     <w:p>
+      <w:pPr>
+        <w:pStyle w:val="ListBullet"/>
+      </w:pPr>
       <w:r>
-        <w:t xml:space="preserve">   - 展示 `services.json` 中的 `file-box`、`custom-note`、`custom-command`、`custom-web`，说明具体能力由 handler 提供。</w:t>
+        <w:t>展示 `services.json` 中的 `file-box`、`custom-note`、`custom-command`、`custom-web`，说明具体能力由 handler 提供。</w:t>
       </w:r>
     </w:p>
     <w:p>
@@ -2167,18 +2018,27 @@
       </w:r>
     </w:p>
     <w:p>
+      <w:pPr>
+        <w:pStyle w:val="ListBullet"/>
+      </w:pPr>
       <w:r>
-        <w:t xml:space="preserve">   - 运行 `python3 relay.py --host 127.0.0.1 --port 9000`。</w:t>
+        <w:t>运行 `python3 relay.py --host 127.0.0.1 --port 9000 --log-file relay.log`。</w:t>
       </w:r>
     </w:p>
     <w:p>
+      <w:pPr>
+        <w:pStyle w:val="ListBullet"/>
+      </w:pPr>
       <w:r>
-        <w:t xml:space="preserve">   - 说明 Relay 只负责登录、服务目录、校验、转发和日志。</w:t>
+        <w:t>说明 Relay 只负责登录、服务目录、校验、转发和日志。</w:t>
       </w:r>
     </w:p>
     <w:p>
+      <w:pPr>
+        <w:pStyle w:val="ListBullet"/>
+      </w:pPr>
       <w:r>
-        <w:t xml:space="preserve">   - 让屏幕中能看到 Relay 输出的 JSON 行日志。</w:t>
+        <w:t>让屏幕中能看到 Relay 输出的 JSON 行日志。</w:t>
       </w:r>
     </w:p>
     <w:p>
@@ -2190,18 +2050,27 @@
       </w:r>
     </w:p>
     <w:p>
+      <w:pPr>
+        <w:pStyle w:val="ListBullet"/>
+      </w:pPr>
       <w:r>
-        <w:t xml:space="preserve">   - 运行 `python3 agent.py`。</w:t>
+        <w:t>运行 `python3 agent.py`。</w:t>
       </w:r>
     </w:p>
     <w:p>
+      <w:pPr>
+        <w:pStyle w:val="ListBullet"/>
+      </w:pPr>
       <w:r>
-        <w:t xml:space="preserve">   - 展示 Agent 加载了几个 handler，并发布了几个服务。</w:t>
+        <w:t>展示 Agent 加载了几个 handler，并发布了几个服务。</w:t>
       </w:r>
     </w:p>
     <w:p>
+      <w:pPr>
+        <w:pStyle w:val="ListBullet"/>
+      </w:pPr>
       <w:r>
-        <w:t xml:space="preserve">   - 说明 Agent 没有默认发布服务，发布内容来自 `services.json`。</w:t>
+        <w:t>说明 Agent 没有默认发布服务，发布内容来自 `services.json`。</w:t>
       </w:r>
     </w:p>
     <w:p>
@@ -2213,23 +2082,35 @@
       </w:r>
     </w:p>
     <w:p>
+      <w:pPr>
+        <w:pStyle w:val="ListBullet"/>
+      </w:pPr>
       <w:r>
-        <w:t xml:space="preserve">   - 运行 `python3 client.py`。</w:t>
+        <w:t>运行 `python3 client.py`。</w:t>
       </w:r>
     </w:p>
     <w:p>
+      <w:pPr>
+        <w:pStyle w:val="ListBullet"/>
+      </w:pPr>
       <w:r>
-        <w:t xml:space="preserve">   - 输入 `list`。</w:t>
+        <w:t>输入 `list`。</w:t>
       </w:r>
     </w:p>
     <w:p>
+      <w:pPr>
+        <w:pStyle w:val="ListBullet"/>
+      </w:pPr>
       <w:r>
-        <w:t xml:space="preserve">   - 输入 `help file-box`，展示服务级帮助。</w:t>
+        <w:t>输入 `help file-box`，展示服务级帮助。</w:t>
       </w:r>
     </w:p>
     <w:p>
+      <w:pPr>
+        <w:pStyle w:val="ListBullet"/>
+      </w:pPr>
       <w:r>
-        <w:t xml:space="preserve">   - 输入 `help custom-command`，展示命令白名单。</w:t>
+        <w:t>输入 `help custom-command`，展示命令白名单。</w:t>
       </w:r>
     </w:p>
     <w:p>
@@ -2241,23 +2122,35 @@
       </w:r>
     </w:p>
     <w:p>
+      <w:pPr>
+        <w:pStyle w:val="ListBullet"/>
+      </w:pPr>
       <w:r>
-        <w:t xml:space="preserve">   - 输入 `text hello`，展示文本回显。</w:t>
+        <w:t>输入 `text hello`，展示文本回显。</w:t>
       </w:r>
     </w:p>
     <w:p>
+      <w:pPr>
+        <w:pStyle w:val="ListBullet"/>
+      </w:pPr>
       <w:r>
-        <w:t xml:space="preserve">   - 输入 `cmd pwd`，展示白名单命令输出。</w:t>
+        <w:t>输入 `cmd pwd`，展示白名单命令输出。</w:t>
       </w:r>
     </w:p>
     <w:p>
+      <w:pPr>
+        <w:pStyle w:val="ListBullet"/>
+      </w:pPr>
       <w:r>
-        <w:t xml:space="preserve">   - 先准备 `shared_files/hello.txt`，再输入 `file ls` 和 `file read hello.txt`，展示文件服务。</w:t>
+        <w:t>先准备 `shared_files/hello.txt`，再输入 `file ls` 和 `file read hello.txt`，展示文件服务。</w:t>
       </w:r>
     </w:p>
     <w:p>
+      <w:pPr>
+        <w:pStyle w:val="ListBullet"/>
+      </w:pPr>
       <w:r>
-        <w:t xml:space="preserve">   - 如果要展示 HTTP 服务，另开终端运行 `python3 -m http.server 8000`，再输入 `http /`。</w:t>
+        <w:t>如果要展示 HTTP 服务，另开终端运行 `python3 -m http.server 8000`，再输入 `http /`。</w:t>
       </w:r>
     </w:p>
     <w:p>
@@ -2269,18 +2162,27 @@
       </w:r>
     </w:p>
     <w:p>
+      <w:pPr>
+        <w:pStyle w:val="ListBullet"/>
+      </w:pPr>
       <w:r>
-        <w:t xml:space="preserve">   - 可以另开一个 Client，用错误 `service_token` 调用，展示 `SERVICE_TOKEN_INVALID`。</w:t>
+        <w:t>可以另开一个 Client，用错误 `service_token` 调用，展示 `SERVICE_TOKEN_INVALID`。</w:t>
       </w:r>
     </w:p>
     <w:p>
+      <w:pPr>
+        <w:pStyle w:val="ListBullet"/>
+      </w:pPr>
       <w:r>
-        <w:t xml:space="preserve">   - 或输入不符合 schema 的 `generic` 调用，展示 `SCHEMA_VALIDATION_FAILED`。</w:t>
+        <w:t>或输入不符合 schema 的 `generic` 调用，展示 `SCHEMA_VALIDATION_FAILED`。</w:t>
       </w:r>
     </w:p>
     <w:p>
+      <w:pPr>
+        <w:pStyle w:val="ListBullet"/>
+      </w:pPr>
       <w:r>
-        <w:t xml:space="preserve">   - 同时切到 Relay 终端，展示 `call_rejected` 日志。</w:t>
+        <w:t>同时切到 Relay 终端，展示 `call_rejected` 日志。</w:t>
       </w:r>
     </w:p>
     <w:p>
@@ -2292,18 +2194,27 @@
       </w:r>
     </w:p>
     <w:p>
+      <w:pPr>
+        <w:pStyle w:val="ListBullet"/>
+      </w:pPr>
       <w:r>
-        <w:t xml:space="preserve">   - 停止 Agent。</w:t>
+        <w:t>停止 Agent。</w:t>
       </w:r>
     </w:p>
     <w:p>
+      <w:pPr>
+        <w:pStyle w:val="ListBullet"/>
+      </w:pPr>
       <w:r>
-        <w:t xml:space="preserve">   - Client 再执行一次调用或 `list`，观察 offline 或 `AGENT_OFFLINE`。</w:t>
+        <w:t>Client 再执行一次调用或 `list`，观察 offline 或 `AGENT_OFFLINE`。</w:t>
       </w:r>
     </w:p>
     <w:p>
+      <w:pPr>
+        <w:pStyle w:val="ListBullet"/>
+      </w:pPr>
       <w:r>
-        <w:t xml:space="preserve">   - 说明这是 Relay 通过连接关闭和保活维护的生命周期状态。</w:t>
+        <w:t>说明这是 Relay 通过连接关闭和保活维护的生命周期状态。</w:t>
       </w:r>
     </w:p>
     <w:p>
@@ -2340,7 +2251,7 @@
     </w:p>
     <w:p>
       <w:pPr>
-        <w:pStyle w:val="Heading2"/>
+        <w:pStyle w:val="Heading3"/>
       </w:pPr>
       <w:r>
         <w:t>16. LLM 使用说明</w:t>
@@ -2430,7 +2341,7 @@
     </w:p>
     <w:p>
       <w:pPr>
-        <w:pStyle w:val="Heading2"/>
+        <w:pStyle w:val="Heading3"/>
       </w:pPr>
       <w:r>
         <w:t>17. 小结</w:t>

</xml_diff>